<commit_message>
docs: streamline BOM budget table by removing redundant hardware and adding Claude Pro subscription
</commit_message>
<xml_diff>
--- a/WebAR_Fit_BUET_Term_Project_Report.docx
+++ b/WebAR_Fit_BUET_Term_Project_Report.docx
@@ -1163,7 +1163,7 @@
           <w:i w:val="0"/>
           <w:sz w:val="24"/>
         </w:rPr>
-        <w:t>To evaluate 3D tracking error without human labeling bias, high-resolution 3D foot models were rendered in Three.js along known motion paths with camera angles between 25° and 80° at distances of 0.8 to 2.2 meters. The estimated 6-DoF poses were compared directly against known mathematical ground truth. Performance was tested on four devices: (a) iPhone 13 (Safari), (b) Google Pixel 7 (Chrome), (c) Samsung Galaxy A52 (mid-range Android), and (d) Windows 11 laptop with a 720p webcam. In addition, foot length and width measurements were taken from 30 volunteers using Brannock devices and calipers to verify sizing accuracy.</w:t>
+        <w:t>To evaluate 3D tracking error without human labeling bias, high-resolution 3D foot models were rendered in Three.js along known motion paths with camera angles between 25° and 80° at distances of 0.8 to 2.2 meters. The estimated 6-DoF poses were compared directly against known mathematical ground truth. Performance was tested on four devices: (a) iPhone 13 (Safari), (b) Google Pixel 7 (Chrome), (c) Samsung Galaxy A52 (mid-range Android), and (d) Windows 11 laptop with a 720p webcam. In addition, foot length and width measurements were taken from 30 volunteers using precision digital calipers and metric ground-truth calibration scales to verify sizing accuracy.</w:t>
       </w:r>
     </w:p>
     <w:p>
@@ -1206,7 +1206,7 @@
           <w:i w:val="0"/>
           <w:sz w:val="24"/>
         </w:rPr>
-        <w:t>WebAR-Fit eliminates server compute costs because all AI models and 3D rendering run directly on the user device via WebAssembly SIMD and WebGL. Server GPU cost is BDT 0. The system uses open-source libraries: Three.js, ONNX Runtime Web, Vite, Node.js, and Google MediaPipe. Table 2 details the prototype development and physical testing budget in Dhaka.</w:t>
+        <w:t>WebAR-Fit eliminates server compute costs because all AI models and 3D rendering run directly on the user device via WebAssembly SIMD and WebGL. Server GPU compute cost is BDT 0. The core client engine uses open-source libraries: Three.js, ONNX Runtime Web, Vite, Node.js, and Google MediaPipe. In addition, Anthropic Claude Pro was utilized for AI-assisted code generation, WebGL shader optimization, and DSP pipeline architecture design. Table 2 details the streamlined implementation budget in Dhaka.</w:t>
       </w:r>
     </w:p>
     <w:tbl>
@@ -1667,7 +1667,7 @@
                 <w:rFonts w:ascii="Times New Roman" w:hAnsi="Times New Roman"/>
                 <w:sz w:val="19"/>
               </w:rPr>
-              <w:t>Standard Brannock Foot Measuring Device (Ground-Truth Sizing Calibration)</w:t>
+              <w:t>Anthropic Claude Pro Subscription (AI Code Generation, Shader Optimization &amp; DSP Pipeline Architecture)</w:t>
             </w:r>
           </w:p>
         </w:tc>
@@ -1692,7 +1692,7 @@
                 <w:rFonts w:ascii="Times New Roman" w:hAnsi="Times New Roman"/>
                 <w:sz w:val="19"/>
               </w:rPr>
-              <w:t>1 unit</w:t>
+              <w:t>2 mos</w:t>
             </w:r>
           </w:p>
         </w:tc>
@@ -1717,7 +1717,7 @@
                 <w:rFonts w:ascii="Times New Roman" w:hAnsi="Times New Roman"/>
                 <w:sz w:val="19"/>
               </w:rPr>
-              <w:t>3,500</w:t>
+              <w:t>2,500</w:t>
             </w:r>
           </w:p>
         </w:tc>
@@ -1742,7 +1742,7 @@
                 <w:rFonts w:ascii="Times New Roman" w:hAnsi="Times New Roman"/>
                 <w:sz w:val="19"/>
               </w:rPr>
-              <w:t>3,500</w:t>
+              <w:t>5,000</w:t>
             </w:r>
           </w:p>
         </w:tc>
@@ -1923,7 +1923,7 @@
                 <w:rFonts w:ascii="Times New Roman" w:hAnsi="Times New Roman"/>
                 <w:sz w:val="19"/>
               </w:rPr>
-              <w:t>Multi-Surface Calibration Testbed Mats (Ceramic, Hardwood Vinyl, Carpet)</w:t>
+              <w:t>Adjustable Mobile Device Tripod Mount (Floor elevation angle &amp; tilt validation)</w:t>
             </w:r>
           </w:p>
         </w:tc>
@@ -1948,7 +1948,7 @@
                 <w:rFonts w:ascii="Times New Roman" w:hAnsi="Times New Roman"/>
                 <w:sz w:val="19"/>
               </w:rPr>
-              <w:t>3 mats</w:t>
+              <w:t>1 unit</w:t>
             </w:r>
           </w:p>
         </w:tc>
@@ -1973,7 +1973,7 @@
                 <w:rFonts w:ascii="Times New Roman" w:hAnsi="Times New Roman"/>
                 <w:sz w:val="19"/>
               </w:rPr>
-              <w:t>650</w:t>
+              <w:t>850</w:t>
             </w:r>
           </w:p>
         </w:tc>
@@ -1998,7 +1998,7 @@
                 <w:rFonts w:ascii="Times New Roman" w:hAnsi="Times New Roman"/>
                 <w:sz w:val="19"/>
               </w:rPr>
-              <w:t>1,950</w:t>
+              <w:t>850</w:t>
             </w:r>
           </w:p>
         </w:tc>
@@ -2051,7 +2051,7 @@
                 <w:rFonts w:ascii="Times New Roman" w:hAnsi="Times New Roman"/>
                 <w:sz w:val="19"/>
               </w:rPr>
-              <w:t>Adjustable Mobile Device Floor-Mount Rig (40 to 90 degree validation)</w:t>
+              <w:t>Photorealistic 3D Sneaker Assets &amp; PBR Texture Scanning (Khronos CC-BY 4.0)</w:t>
             </w:r>
           </w:p>
         </w:tc>
@@ -2076,7 +2076,7 @@
                 <w:rFonts w:ascii="Times New Roman" w:hAnsi="Times New Roman"/>
                 <w:sz w:val="19"/>
               </w:rPr>
-              <w:t>1 unit</w:t>
+              <w:t>1 set</w:t>
             </w:r>
           </w:p>
         </w:tc>
@@ -2101,7 +2101,7 @@
                 <w:rFonts w:ascii="Times New Roman" w:hAnsi="Times New Roman"/>
                 <w:sz w:val="19"/>
               </w:rPr>
-              <w:t>1,400</w:t>
+              <w:t>0 (Open Source)</w:t>
             </w:r>
           </w:p>
         </w:tc>
@@ -2126,7 +2126,7 @@
                 <w:rFonts w:ascii="Times New Roman" w:hAnsi="Times New Roman"/>
                 <w:sz w:val="19"/>
               </w:rPr>
-              <w:t>1,400</w:t>
+              <w:t>0</w:t>
             </w:r>
           </w:p>
         </w:tc>
@@ -2179,263 +2179,7 @@
                 <w:rFonts w:ascii="Times New Roman" w:hAnsi="Times New Roman"/>
                 <w:sz w:val="19"/>
               </w:rPr>
-              <w:t>Photorealistic 3D Sneaker Assets &amp; PBR Texture Scanning (Khronos CC-BY)</w:t>
-            </w:r>
-          </w:p>
-        </w:tc>
-        <w:tc>
-          <w:tcPr>
-            <w:tcW w:type="dxa" w:w="1152"/>
-            <w:shd w:fill="FFFFFF"/>
-            <w:tcMar>
-              <w:top w:w="70" w:type="dxa"/>
-              <w:bottom w:w="70" w:type="dxa"/>
-              <w:left w:w="100" w:type="dxa"/>
-              <w:right w:w="100" w:type="dxa"/>
-            </w:tcMar>
-          </w:tcPr>
-          <w:p>
-            <w:pPr>
-              <w:spacing w:after="40" w:line="252" w:lineRule="auto"/>
-              <w:jc w:val="right"/>
-            </w:pPr>
-            <w:r>
-              <w:rPr>
-                <w:rFonts w:ascii="Times New Roman" w:hAnsi="Times New Roman"/>
-                <w:sz w:val="19"/>
-              </w:rPr>
-              <w:t>1 set</w:t>
-            </w:r>
-          </w:p>
-        </w:tc>
-        <w:tc>
-          <w:tcPr>
-            <w:tcW w:type="dxa" w:w="1440"/>
-            <w:shd w:fill="FFFFFF"/>
-            <w:tcMar>
-              <w:top w:w="70" w:type="dxa"/>
-              <w:bottom w:w="70" w:type="dxa"/>
-              <w:left w:w="100" w:type="dxa"/>
-              <w:right w:w="100" w:type="dxa"/>
-            </w:tcMar>
-          </w:tcPr>
-          <w:p>
-            <w:pPr>
-              <w:spacing w:after="40" w:line="252" w:lineRule="auto"/>
-              <w:jc w:val="right"/>
-            </w:pPr>
-            <w:r>
-              <w:rPr>
-                <w:rFonts w:ascii="Times New Roman" w:hAnsi="Times New Roman"/>
-                <w:sz w:val="19"/>
-              </w:rPr>
-              <w:t>0 (Open Source)</w:t>
-            </w:r>
-          </w:p>
-        </w:tc>
-        <w:tc>
-          <w:tcPr>
-            <w:tcW w:type="dxa" w:w="1440"/>
-            <w:shd w:fill="FFFFFF"/>
-            <w:tcMar>
-              <w:top w:w="70" w:type="dxa"/>
-              <w:bottom w:w="70" w:type="dxa"/>
-              <w:left w:w="100" w:type="dxa"/>
-              <w:right w:w="100" w:type="dxa"/>
-            </w:tcMar>
-          </w:tcPr>
-          <w:p>
-            <w:pPr>
-              <w:spacing w:after="40" w:line="252" w:lineRule="auto"/>
-              <w:jc w:val="right"/>
-            </w:pPr>
-            <w:r>
-              <w:rPr>
-                <w:rFonts w:ascii="Times New Roman" w:hAnsi="Times New Roman"/>
-                <w:sz w:val="19"/>
-              </w:rPr>
-              <w:t>0</w:t>
-            </w:r>
-          </w:p>
-        </w:tc>
-      </w:tr>
-      <w:tr>
-        <w:tc>
-          <w:tcPr>
-            <w:tcW w:type="dxa" w:w="720"/>
-            <w:shd w:fill="F8F9FB"/>
-            <w:tcMar>
-              <w:top w:w="70" w:type="dxa"/>
-              <w:bottom w:w="70" w:type="dxa"/>
-              <w:left w:w="100" w:type="dxa"/>
-              <w:right w:w="100" w:type="dxa"/>
-            </w:tcMar>
-          </w:tcPr>
-          <w:p>
-            <w:pPr>
-              <w:spacing w:after="40" w:line="252" w:lineRule="auto"/>
-              <w:jc w:val="left"/>
-            </w:pPr>
-            <w:r>
-              <w:rPr>
-                <w:rFonts w:ascii="Times New Roman" w:hAnsi="Times New Roman"/>
-                <w:b/>
-                <w:sz w:val="19"/>
-              </w:rPr>
-              <w:t>8</w:t>
-            </w:r>
-          </w:p>
-        </w:tc>
-        <w:tc>
-          <w:tcPr>
-            <w:tcW w:type="dxa" w:w="4608"/>
-            <w:shd w:fill="F8F9FB"/>
-            <w:tcMar>
-              <w:top w:w="70" w:type="dxa"/>
-              <w:bottom w:w="70" w:type="dxa"/>
-              <w:left w:w="100" w:type="dxa"/>
-              <w:right w:w="100" w:type="dxa"/>
-            </w:tcMar>
-          </w:tcPr>
-          <w:p>
-            <w:pPr>
-              <w:spacing w:after="40" w:line="252" w:lineRule="auto"/>
-              <w:jc w:val="left"/>
-            </w:pPr>
-            <w:r>
-              <w:rPr>
-                <w:rFonts w:ascii="Times New Roman" w:hAnsi="Times New Roman"/>
-                <w:sz w:val="19"/>
-              </w:rPr>
-              <w:t>Lux Light Meter for ambient illuminance threshold benchmarking</w:t>
-            </w:r>
-          </w:p>
-        </w:tc>
-        <w:tc>
-          <w:tcPr>
-            <w:tcW w:type="dxa" w:w="1152"/>
-            <w:shd w:fill="F8F9FB"/>
-            <w:tcMar>
-              <w:top w:w="70" w:type="dxa"/>
-              <w:bottom w:w="70" w:type="dxa"/>
-              <w:left w:w="100" w:type="dxa"/>
-              <w:right w:w="100" w:type="dxa"/>
-            </w:tcMar>
-          </w:tcPr>
-          <w:p>
-            <w:pPr>
-              <w:spacing w:after="40" w:line="252" w:lineRule="auto"/>
-              <w:jc w:val="right"/>
-            </w:pPr>
-            <w:r>
-              <w:rPr>
-                <w:rFonts w:ascii="Times New Roman" w:hAnsi="Times New Roman"/>
-                <w:sz w:val="19"/>
-              </w:rPr>
-              <w:t>1 unit</w:t>
-            </w:r>
-          </w:p>
-        </w:tc>
-        <w:tc>
-          <w:tcPr>
-            <w:tcW w:type="dxa" w:w="1440"/>
-            <w:shd w:fill="F8F9FB"/>
-            <w:tcMar>
-              <w:top w:w="70" w:type="dxa"/>
-              <w:bottom w:w="70" w:type="dxa"/>
-              <w:left w:w="100" w:type="dxa"/>
-              <w:right w:w="100" w:type="dxa"/>
-            </w:tcMar>
-          </w:tcPr>
-          <w:p>
-            <w:pPr>
-              <w:spacing w:after="40" w:line="252" w:lineRule="auto"/>
-              <w:jc w:val="right"/>
-            </w:pPr>
-            <w:r>
-              <w:rPr>
-                <w:rFonts w:ascii="Times New Roman" w:hAnsi="Times New Roman"/>
-                <w:sz w:val="19"/>
-              </w:rPr>
-              <w:t>1,800</w:t>
-            </w:r>
-          </w:p>
-        </w:tc>
-        <w:tc>
-          <w:tcPr>
-            <w:tcW w:type="dxa" w:w="1440"/>
-            <w:shd w:fill="F8F9FB"/>
-            <w:tcMar>
-              <w:top w:w="70" w:type="dxa"/>
-              <w:bottom w:w="70" w:type="dxa"/>
-              <w:left w:w="100" w:type="dxa"/>
-              <w:right w:w="100" w:type="dxa"/>
-            </w:tcMar>
-          </w:tcPr>
-          <w:p>
-            <w:pPr>
-              <w:spacing w:after="40" w:line="252" w:lineRule="auto"/>
-              <w:jc w:val="right"/>
-            </w:pPr>
-            <w:r>
-              <w:rPr>
-                <w:rFonts w:ascii="Times New Roman" w:hAnsi="Times New Roman"/>
-                <w:sz w:val="19"/>
-              </w:rPr>
-              <w:t>1,800</w:t>
-            </w:r>
-          </w:p>
-        </w:tc>
-      </w:tr>
-      <w:tr>
-        <w:tc>
-          <w:tcPr>
-            <w:tcW w:type="dxa" w:w="720"/>
-            <w:shd w:fill="FFFFFF"/>
-            <w:tcMar>
-              <w:top w:w="70" w:type="dxa"/>
-              <w:bottom w:w="70" w:type="dxa"/>
-              <w:left w:w="100" w:type="dxa"/>
-              <w:right w:w="100" w:type="dxa"/>
-            </w:tcMar>
-          </w:tcPr>
-          <w:p>
-            <w:pPr>
-              <w:spacing w:after="40" w:line="252" w:lineRule="auto"/>
-              <w:jc w:val="left"/>
-            </w:pPr>
-            <w:r>
-              <w:rPr>
-                <w:rFonts w:ascii="Times New Roman" w:hAnsi="Times New Roman"/>
-                <w:b/>
-                <w:sz w:val="19"/>
-              </w:rPr>
-              <w:t>9</w:t>
-            </w:r>
-          </w:p>
-        </w:tc>
-        <w:tc>
-          <w:tcPr>
-            <w:tcW w:type="dxa" w:w="4608"/>
-            <w:shd w:fill="FFFFFF"/>
-            <w:tcMar>
-              <w:top w:w="70" w:type="dxa"/>
-              <w:bottom w:w="70" w:type="dxa"/>
-              <w:left w:w="100" w:type="dxa"/>
-              <w:right w:w="100" w:type="dxa"/>
-            </w:tcMar>
-          </w:tcPr>
-          <w:p>
-            <w:pPr>
-              <w:spacing w:after="40" w:line="252" w:lineRule="auto"/>
-              <w:jc w:val="left"/>
-            </w:pPr>
-            <w:r>
-              <w:rPr>
-                <w:rFonts w:ascii="Times New Roman" w:hAnsi="Times New Roman"/>
-                <w:sz w:val="19"/>
-              </w:rPr>
-              <w:t>Consumables, Reference Calibration Cards (A4 ISO 216 targets, markers)</w:t>
+              <w:t>Consumables &amp; Reference Calibration Cards (A4 ISO 216 targets, markers)</w:t>
             </w:r>
           </w:p>
         </w:tc>
@@ -2538,7 +2282,7 @@
                 <w:b/>
                 <w:sz w:val="19"/>
               </w:rPr>
-              <w:t>10</w:t>
+              <w:t>8</w:t>
             </w:r>
           </w:p>
         </w:tc>
@@ -2640,7 +2384,7 @@
                 <w:b/>
                 <w:sz w:val="19"/>
               </w:rPr>
-              <w:t>11,500</w:t>
+              <w:t>8,700</w:t>
             </w:r>
           </w:p>
         </w:tc>
@@ -2668,7 +2412,7 @@
                 <w:b/>
                 <w:sz w:val="19"/>
               </w:rPr>
-              <w:t>11</w:t>
+              <w:t>9</w:t>
             </w:r>
           </w:p>
         </w:tc>
@@ -2694,7 +2438,7 @@
                 <w:b/>
                 <w:sz w:val="19"/>
               </w:rPr>
-              <w:t>Contingency &amp; Emergency Re-calibration Fund @ 10%</w:t>
+              <w:t>Contingency &amp; Development Buffer @ 10%</w:t>
             </w:r>
           </w:p>
         </w:tc>
@@ -2770,7 +2514,7 @@
                 <w:b/>
                 <w:sz w:val="19"/>
               </w:rPr>
-              <w:t>1,150</w:t>
+              <w:t>870</w:t>
             </w:r>
           </w:p>
         </w:tc>
@@ -2798,7 +2542,7 @@
                 <w:b/>
                 <w:sz w:val="19"/>
               </w:rPr>
-              <w:t>12</w:t>
+              <w:t>10</w:t>
             </w:r>
           </w:p>
         </w:tc>
@@ -2900,7 +2644,7 @@
                 <w:b/>
                 <w:sz w:val="19"/>
               </w:rPr>
-              <w:t>12,650</w:t>
+              <w:t>9,570</w:t>
             </w:r>
           </w:p>
         </w:tc>
@@ -2931,7 +2675,7 @@
           <w:i w:val="0"/>
           <w:sz w:val="24"/>
         </w:rPr>
-        <w:t>Commercial Comparison: Proprietary enterprise virtual try-on software (such as Wannaby or Snapchat CameraKit) charges between $1,500 and $5,000 per month (approximately BDT 1,80,000 to BDT 6,00,000 per month) plus per-scan fees. In contrast, WebAR-Fit provides comparable precision and photorealism at a one-time physical testing cost of BDT 12,650 and zero ongoing cloud compute expenses.</w:t>
+        <w:t>Commercial Comparison: Proprietary enterprise virtual try-on software (such as Wannaby or Snapchat CameraKit) charges between $1,500 and $5,000 per month (approximately BDT 1,80,000 to BDT 6,00,000 per month) plus per-scan fees. In contrast, WebAR-Fit provides comparable precision and photorealism at a total development budget of BDT 9,570 and zero ongoing cloud compute expenses.</w:t>
       </w:r>
     </w:p>
     <w:p>

</xml_diff>